<commit_message>
Update templates and resume flow
</commit_message>
<xml_diff>
--- a/templates/Interface.docx
+++ b/templates/Interface.docx
@@ -1023,6 +1023,26 @@
                 <w:sz w:val="20"/>
               </w:rPr>
             </w:pPr>
+            <w:r>
+              <w:rPr>
+                <w:rFonts w:ascii="Verdana" w:hAnsi="Verdana"/>
+              </w:rPr>
+              <w:t>{{resume[‘</w:t>
+            </w:r>
+            <w:proofErr w:type="spellStart"/>
+            <w:r>
+              <w:rPr>
+                <w:rFonts w:ascii="Verdana" w:hAnsi="Verdana"/>
+              </w:rPr>
+              <w:t>client_owner_phone</w:t>
+            </w:r>
+            <w:proofErr w:type="spellEnd"/>
+            <w:r>
+              <w:rPr>
+                <w:rFonts w:ascii="Verdana" w:hAnsi="Verdana"/>
+              </w:rPr>
+              <w:t>’]}}</w:t>
+            </w:r>
           </w:p>
         </w:tc>
       </w:tr>
@@ -1209,6 +1229,26 @@
                 <w:rFonts w:asciiTheme="minorHAnsi" w:hAnsiTheme="minorHAnsi" w:cstheme="minorHAnsi"/>
               </w:rPr>
             </w:pPr>
+            <w:r>
+              <w:rPr>
+                <w:rFonts w:ascii="Verdana" w:hAnsi="Verdana"/>
+              </w:rPr>
+              <w:t>{{resume[‘</w:t>
+            </w:r>
+            <w:proofErr w:type="spellStart"/>
+            <w:r>
+              <w:rPr>
+                <w:rFonts w:ascii="Verdana" w:hAnsi="Verdana"/>
+              </w:rPr>
+              <w:t>functional_owner_phone</w:t>
+            </w:r>
+            <w:proofErr w:type="spellEnd"/>
+            <w:r>
+              <w:rPr>
+                <w:rFonts w:ascii="Verdana" w:hAnsi="Verdana"/>
+              </w:rPr>
+              <w:t>’]}}</w:t>
+            </w:r>
           </w:p>
         </w:tc>
       </w:tr>
@@ -1395,6 +1435,26 @@
                 <w:rFonts w:asciiTheme="minorHAnsi" w:hAnsiTheme="minorHAnsi" w:cstheme="minorHAnsi"/>
               </w:rPr>
             </w:pPr>
+            <w:r>
+              <w:rPr>
+                <w:rFonts w:ascii="Verdana" w:hAnsi="Verdana"/>
+              </w:rPr>
+              <w:t>{{resume[‘</w:t>
+            </w:r>
+            <w:proofErr w:type="spellStart"/>
+            <w:r>
+              <w:rPr>
+                <w:rFonts w:ascii="Verdana" w:hAnsi="Verdana"/>
+              </w:rPr>
+              <w:t>technical_owner_phone</w:t>
+            </w:r>
+            <w:proofErr w:type="spellEnd"/>
+            <w:r>
+              <w:rPr>
+                <w:rFonts w:ascii="Verdana" w:hAnsi="Verdana"/>
+              </w:rPr>
+              <w:t>’]}}</w:t>
+            </w:r>
           </w:p>
         </w:tc>
       </w:tr>
@@ -1581,6 +1641,26 @@
                 <w:rFonts w:asciiTheme="minorHAnsi" w:hAnsiTheme="minorHAnsi" w:cstheme="minorHAnsi"/>
               </w:rPr>
             </w:pPr>
+            <w:r>
+              <w:rPr>
+                <w:rFonts w:ascii="Verdana" w:hAnsi="Verdana"/>
+              </w:rPr>
+              <w:t>{{resume[‘</w:t>
+            </w:r>
+            <w:proofErr w:type="spellStart"/>
+            <w:r>
+              <w:rPr>
+                <w:rFonts w:ascii="Verdana" w:hAnsi="Verdana"/>
+              </w:rPr>
+              <w:t>developer_phone</w:t>
+            </w:r>
+            <w:proofErr w:type="spellEnd"/>
+            <w:r>
+              <w:rPr>
+                <w:rFonts w:ascii="Verdana" w:hAnsi="Verdana"/>
+              </w:rPr>
+              <w:t>’]}}</w:t>
+            </w:r>
           </w:p>
         </w:tc>
       </w:tr>
@@ -22568,21 +22648,6 @@
 </file>
 
 <file path=customXml/item1.xml><?xml version="1.0" encoding="utf-8"?>
-<p:properties xmlns:p="http://schemas.microsoft.com/office/2006/metadata/properties" xmlns:xsi="http://www.w3.org/2001/XMLSchema-instance" xmlns:pc="http://schemas.microsoft.com/office/infopath/2007/PartnerControls">
-  <documentManagement/>
-</p:properties>
-</file>
-
-<file path=customXml/item2.xml><?xml version="1.0" encoding="utf-8"?>
-<?mso-contentType ?>
-<FormTemplates xmlns="http://schemas.microsoft.com/sharepoint/v3/contenttype/forms">
-  <Display>DocumentLibraryForm</Display>
-  <Edit>DocumentLibraryForm</Edit>
-  <New>DocumentLibraryForm</New>
-</FormTemplates>
-</file>
-
-<file path=customXml/item3.xml><?xml version="1.0" encoding="utf-8"?>
 <ct:contentTypeSchema xmlns:ct="http://schemas.microsoft.com/office/2006/metadata/contentType" xmlns:ma="http://schemas.microsoft.com/office/2006/metadata/properties/metaAttributes" ct:_="" ma:_="" ma:contentTypeName="Document" ma:contentTypeID="0x0101000A49EB99E6499D439FB507E92DFB948A" ma:contentTypeVersion="3" ma:contentTypeDescription="Create a new document." ma:contentTypeScope="" ma:versionID="4e6393af3769a3037de78fdd1e5290c4">
   <xsd:schema xmlns:xsd="http://www.w3.org/2001/XMLSchema" xmlns:xs="http://www.w3.org/2001/XMLSchema" xmlns:p="http://schemas.microsoft.com/office/2006/metadata/properties" xmlns:ns2="ba4cc30b-c043-49b1-8e93-4c9262a918f0" targetNamespace="http://schemas.microsoft.com/office/2006/metadata/properties" ma:root="true" ma:fieldsID="a22f4753efaf92b99cb84030fbd56b80" ns2:_="">
     <xsd:import namespace="ba4cc30b-c043-49b1-8e93-4c9262a918f0"/>
@@ -22720,24 +22785,22 @@
 </ct:contentTypeSchema>
 </file>
 
-<file path=customXml/itemProps1.xml><?xml version="1.0" encoding="utf-8"?>
-<ds:datastoreItem xmlns:ds="http://schemas.openxmlformats.org/officeDocument/2006/customXml" ds:itemID="{CCF0CE80-BF41-43B3-877C-5B5E010FDC62}">
-  <ds:schemaRefs>
-    <ds:schemaRef ds:uri="http://schemas.microsoft.com/office/2006/metadata/properties"/>
-    <ds:schemaRef ds:uri="http://schemas.microsoft.com/office/infopath/2007/PartnerControls"/>
-  </ds:schemaRefs>
-</ds:datastoreItem>
+<file path=customXml/item2.xml><?xml version="1.0" encoding="utf-8"?>
+<?mso-contentType ?>
+<FormTemplates xmlns="http://schemas.microsoft.com/sharepoint/v3/contenttype/forms">
+  <Display>DocumentLibraryForm</Display>
+  <Edit>DocumentLibraryForm</Edit>
+  <New>DocumentLibraryForm</New>
+</FormTemplates>
 </file>
 
-<file path=customXml/itemProps2.xml><?xml version="1.0" encoding="utf-8"?>
-<ds:datastoreItem xmlns:ds="http://schemas.openxmlformats.org/officeDocument/2006/customXml" ds:itemID="{E8BDB221-DCB5-404D-B79D-1C500F0A52D6}">
-  <ds:schemaRefs>
-    <ds:schemaRef ds:uri="http://schemas.microsoft.com/sharepoint/v3/contenttype/forms"/>
-  </ds:schemaRefs>
-</ds:datastoreItem>
+<file path=customXml/item3.xml><?xml version="1.0" encoding="utf-8"?>
+<p:properties xmlns:p="http://schemas.microsoft.com/office/2006/metadata/properties" xmlns:xsi="http://www.w3.org/2001/XMLSchema-instance" xmlns:pc="http://schemas.microsoft.com/office/infopath/2007/PartnerControls">
+  <documentManagement/>
+</p:properties>
 </file>
 
-<file path=customXml/itemProps3.xml><?xml version="1.0" encoding="utf-8"?>
+<file path=customXml/itemProps1.xml><?xml version="1.0" encoding="utf-8"?>
 <ds:datastoreItem xmlns:ds="http://schemas.openxmlformats.org/officeDocument/2006/customXml" ds:itemID="{57B35939-85F7-4434-8BC5-E67C78A8BDED}">
   <ds:schemaRefs>
     <ds:schemaRef ds:uri="http://schemas.microsoft.com/office/2006/metadata/contentType"/>
@@ -22753,4 +22816,21 @@
     <ds:schemaRef ds:uri="http://schemas.microsoft.com/internal/obd"/>
   </ds:schemaRefs>
 </ds:datastoreItem>
+</file>
+
+<file path=customXml/itemProps2.xml><?xml version="1.0" encoding="utf-8"?>
+<ds:datastoreItem xmlns:ds="http://schemas.openxmlformats.org/officeDocument/2006/customXml" ds:itemID="{E8BDB221-DCB5-404D-B79D-1C500F0A52D6}">
+  <ds:schemaRefs>
+    <ds:schemaRef ds:uri="http://schemas.microsoft.com/sharepoint/v3/contenttype/forms"/>
+  </ds:schemaRefs>
+</ds:datastoreItem>
+</file>
+
+<file path=customXml/itemProps3.xml><?xml version="1.0" encoding="utf-8"?>
+<ds:datastoreItem xmlns:ds="http://schemas.openxmlformats.org/officeDocument/2006/customXml" ds:itemID="{CCF0CE80-BF41-43B3-877C-5B5E010FDC62}">
+  <ds:schemaRefs>
+    <ds:schemaRef ds:uri="http://schemas.microsoft.com/office/2006/metadata/properties"/>
+    <ds:schemaRef ds:uri="http://schemas.microsoft.com/office/infopath/2007/PartnerControls"/>
+  </ds:schemaRefs>
+</ds:datastoreItem>
 </file>
</xml_diff>